<commit_message>
Foley: resume tightened to one page
Co-Authored-By: Claude Opus 5.5 <noreply@anthropic.com>
Claude-Session: https://claude.ai/code/session_01FBRQCEuHNbZjQ9zAhKMdjS
</commit_message>
<xml_diff>
--- a/applications/foley-director-cs-onboarding/Foley-DirectorCSOnboarding-Resume.docx
+++ b/applications/foley-director-cs-onboarding/Foley-DirectorCSOnboarding-Resume.docx
@@ -80,7 +80,7 @@
           <w:i w:val="0"/>
           <w:color w:val="1A1A1A"/>
         </w:rPr>
-        <w:t>Onboarding leader who has built and run the function, not just worked in it. At Wix I led multiple onboarding teams of up to 30 specialists over two years, piloting team structures as a new vertical went from proof of concept to a profitable business line, running weekly training and 1:1 coaching, and helping hire and train new team members, while personally launching 25+ clients a month at 110% of implementation targets. At Accelo I built the implementation plans that turned sales handoffs into delivery. I build AI and automation into the work to scale it.</w:t>
+        <w:t>Onboarding leader who has run the function, not just worked in it. At Wix I led multiple onboarding teams of up to 30 specialists over two years, piloting team structures as a new vertical went from proof of concept to profitable, running weekly training and 1:1 coaching, and helping hire and train new team members. At Accelo I built the implementation plans that turned sales handoffs into delivery. I build AI and automation into the work to scale it.</w:t>
       </w:r>
     </w:p>
     <w:p>
@@ -764,39 +764,6 @@
         <w:t>B.A. Liberal Arts, Minor in Political Science - Colorado State University, Fort Collins, CO</w:t>
       </w:r>
     </w:p>
-    <w:p>
-      <w:pPr>
-        <w:spacing w:before="140" w:after="60"/>
-        <w:pBdr>
-          <w:bottom w:val="single" w:sz="6" w:space="2" w:color="163a5f"/>
-        </w:pBdr>
-      </w:pPr>
-      <w:r>
-        <w:rPr>
-          <w:rFonts w:ascii="Calibri" w:hAnsi="Calibri"/>
-          <w:b/>
-          <w:i w:val="0"/>
-          <w:caps/>
-          <w:color w:val="163A5F"/>
-          <w:sz w:val="21"/>
-        </w:rPr>
-        <w:t>CERTIFICATIONS</w:t>
-      </w:r>
-    </w:p>
-    <w:p>
-      <w:pPr>
-        <w:spacing w:after="30"/>
-      </w:pPr>
-      <w:r>
-        <w:rPr>
-          <w:rFonts w:ascii="Calibri" w:hAnsi="Calibri"/>
-          <w:b w:val="0"/>
-          <w:i w:val="0"/>
-          <w:color w:val="1A1A1A"/>
-        </w:rPr>
-        <w:t>Google Digital Marketing &amp; E-Commerce Professional Certificate - Google / Coursera (2024)</w:t>
-      </w:r>
-    </w:p>
     <w:sectPr>
       <w:pgSz w:w="12240" w:h="15840"/>
       <w:pgMar w:top="720" w:right="864" w:bottom="720" w:left="864" w:header="720" w:footer="720" w:gutter="0"/>

</xml_diff>